<commit_message>
Insert Zenodo DOI (10.5281/zenodo.21967917) into Data Availability, README, and rebuilt DOCX
- Data and Code Availability: replace acceptance-time placeholder with live concept DOI
- Tiered-interpretation paragraph and Table 2 legend reference the deposition
- README/README_zh: Data availability section + citation now carry the DOI link
- Rebuild AJHG DOCX (1369/1369 runs still Times New Roman; no placeholder leaks)
</commit_message>
<xml_diff>
--- a/docs/manuscript/AJHG_submission_Qiushuo_Geng_20260816.docx
+++ b/docs/manuscript/AJHG_submission_Qiushuo_Geng_20260816.docx
@@ -1774,7 +1774,7 @@
           <w:i w:val="0"/>
           <w:sz w:val="24"/>
         </w:rPr>
-        <w:t>We suggest a tiered interpretation of the atlas. Tier 1 (FDR-core, 121 pairs) comprises high-confidence effector genes for follow-up functional studies. Tier 2 (nominally significant strong pairs, 129 pairs) are hypothesis-generating candidates requiring independent replication. Tier 3 (PP.H4 ≥ 0.5 but &lt; 0.8) carries weak colocalization support and is not recommended for experimental prioritization without additional evidence. This tiering is encoded in the public atlas (Zenodo DOI) to facilitate community use.</w:t>
+        <w:t>We suggest a tiered interpretation of the atlas. Tier 1 (FDR-core, 121 pairs) comprises high-confidence effector genes for follow-up functional studies. Tier 2 (nominally significant strong pairs, 129 pairs) are hypothesis-generating candidates requiring independent replication. Tier 3 (PP.H4 ≥ 0.5 but &lt; 0.8) carries weak colocalization support and is not recommended for experimental prioritization without additional evidence. This tiering is encoded in the public atlas (Zenodo: https://doi.org/10.5281/zenodo.21967917) to facilitate community use.</w:t>
       </w:r>
     </w:p>
     <w:p>
@@ -2016,7 +2016,7 @@
           <w:i w:val="0"/>
           <w:sz w:val="24"/>
         </w:rPr>
-        <w:t>. Colocalization support estimates, instrument lists, replication statistics, and the analysis scripts are provided as a public atlas (Zenodo deposition; DOI to be registered at acceptance). Analysis code is available at https://github.com/qgeng1465/dual-channel-mr-atlas.</w:t>
+        <w:t>. Colocalization support estimates, instrument lists, replication statistics, and the analysis scripts are provided as a public atlas (Zenodo: https://doi.org/10.5281/zenodo.21967917). Analysis code is available at https://github.com/qgeng1465/dual-channel-mr-atlas.</w:t>
       </w:r>
     </w:p>
     <w:p>
@@ -4964,7 +4964,7 @@
           <w:i w:val="0"/>
           <w:sz w:val="22"/>
         </w:rPr>
-        <w:t xml:space="preserve"> Full annotation of the 15 FDR-core strong-colocalization candidates outside the previously reported set. Tier: candidate effector gene at a reported T2D/CAD risk locus (distance to the locus in parentheses) versus weak-locus candidate without T2D/CAD catalog records. GTEx: same-direction eQTL support (consistent / conflicting / not testable). FinnGen p: per-gene association in FinnGen R11 (–, not alignable or no analog). Released with the Zenodo DOI as `Table_2_candidates.csv`.</w:t>
+        <w:t xml:space="preserve"> Full annotation of the 15 FDR-core strong-colocalization candidates outside the previously reported set. Tier: candidate effector gene at a reported T2D/CAD risk locus (distance to the locus in parentheses) versus weak-locus candidate without T2D/CAD catalog records. GTEx: same-direction eQTL support (consistent / conflicting / not testable). FinnGen p: per-gene association in FinnGen R11 (–, not alignable or no analog). Released with the Zenodo deposition (https://doi.org/10.5281/zenodo.21967917) as `Table_2_candidates.csv`.</w:t>
       </w:r>
     </w:p>
     <w:tbl>

</xml_diff>

<commit_message>
Review edits: clarify coloc.susie scope, F-stat reporting, Discussion opener
- 3.6: 'All four FinnGen-significant candidates fell within the six-locus coloc.susie
  sensitivity set and were retained' (was: ambiguous 'retained across the coloc.susie
  sensitivity analysis')
- 3.7: sentence-initial 'Coloc.susie' capitalized
- Discussion: 'We focus on three findings.' (was 'We highlight three results.')
- 2.2: add pointer that F-statistics are in the Zenodo atlas and Fig 5C
- Rebuild AJHG DOCX (1369/1369 runs Times New Roman; no regressions)
</commit_message>
<xml_diff>
--- a/docs/manuscript/AJHG_submission_Qiushuo_Geng_20260816.docx
+++ b/docs/manuscript/AJHG_submission_Qiushuo_Geng_20260816.docx
@@ -966,7 +966,7 @@
           <w:i w:val="0"/>
           <w:sz w:val="24"/>
         </w:rPr>
-        <w:t xml:space="preserve">. MR significance was defined as per-outcome Benjamini–Hochberg FDR control at q &lt; 0.05 </w:t>
+        <w:t xml:space="preserve">. F-statistics are reported in the Zenodo atlas and summarized visually in Figure 5C. MR significance was defined as per-outcome Benjamini–Hochberg FDR control at q &lt; 0.05 </w:t>
       </w:r>
       <w:r>
         <w:rPr>
@@ -1659,7 +1659,7 @@
           <w:i w:val="0"/>
           <w:sz w:val="24"/>
         </w:rPr>
-        <w:t>For the 15 candidate effector genes, GTEx v8 supported the eQTLGen direction in 6/7 gene–trait pairs with an overlapping GTEx eQTL (85.7%; 95% CI 48.7–97.4%; one conflict, VSIG8×CAD). Across the 106 known loci, GTEx v8 direction was consistent with eQTLGen in 44/63 measurable loci (69.8%; 95% CI 57.6–79.8%; Fig 5). None of the 15 candidates is an FG pair (FG has no FinnGen analog). Among the 15, 9/15 were alignable to FinnGen R11, with 9/9 gene-level and 8/9 variant-level direction concordance, and 4 reached FinnGen p &lt; 0.05: RBM6×T2D p = 6.9e-6, CNNM2×CAD p = 6.3e-4, CD101×T2D p = 1.2e-3, RIC8A×CAD p = 1.1e-2 (Fig 5). Of the six non-alignable candidates, five lead variants (U6atac, CWF19L1, N4BP2L2, SLC12A3, PLAUR) were not localized in FinnGen R11 and one (CLEC3B) lacked original summary statistics (Fig 5). All four FinnGen-significant candidates were retained across the coloc.susie sensitivity analysis (Section 3.7). Re-estimating MR directions in pre-UKB outcome GWAS with minimal eQTLGen overlap (Methods 2.2) gave concordant directions for all 15 candidates (11 positive, 4 negative; 0 discordant; Table S4). Sample overlap therefore does not drive the candidate-set MR directions.</w:t>
+        <w:t>For the 15 candidate effector genes, GTEx v8 supported the eQTLGen direction in 6/7 gene–trait pairs with an overlapping GTEx eQTL (85.7%; 95% CI 48.7–97.4%; one conflict, VSIG8×CAD). Across the 106 known loci, GTEx v8 direction was consistent with eQTLGen in 44/63 measurable loci (69.8%; 95% CI 57.6–79.8%; Fig 5). None of the 15 candidates is an FG pair (FG has no FinnGen analog). Among the 15, 9/15 were alignable to FinnGen R11, with 9/9 gene-level and 8/9 variant-level direction concordance, and 4 reached FinnGen p &lt; 0.05: RBM6×T2D p = 6.9e-6, CNNM2×CAD p = 6.3e-4, CD101×T2D p = 1.2e-3, RIC8A×CAD p = 1.1e-2 (Fig 5). Of the six non-alignable candidates, five lead variants (U6atac, CWF19L1, N4BP2L2, SLC12A3, PLAUR) were not localized in FinnGen R11 and one (CLEC3B) lacked original summary statistics (Fig 5). All four FinnGen-significant candidates fell within the six-locus coloc.susie sensitivity set and were retained (Section 3.7). Re-estimating MR directions in pre-UKB outcome GWAS with minimal eQTLGen overlap (Methods 2.2) gave concordant directions for all 15 candidates (11 positive, 4 negative; 0 discordant; Table S4). Sample overlap therefore does not drive the candidate-set MR directions.</w:t>
       </w:r>
     </w:p>
     <w:p>
@@ -1688,7 +1688,7 @@
           <w:i w:val="0"/>
           <w:sz w:val="24"/>
         </w:rPr>
-        <w:t>coloc.susie with SuSiE fine-mapping did not converge under external 1000 Genomes EUR LD for any of the six tested loci spanning different signal architectures (RBM6×T2D, CNNM2×CAD, PLAUR×CAD, CD101×T2D, RIC8A×CAD, LAMC1×CAD). This is a known limitation when summary statistics and reference panels are imperfectly matched. We therefore do not rely on SuSiE posteriors for primary inference and report them only as exploratory sensitivity evidence (Table S2). The one locus that showed multi-signal architecture, LAMC1×CAD (coloc.abf PP.H4 = 0.9139), was independently excluded by the FDR filter (padj ≥ 0.05): fine-mapping revealed eight independent eQTL credible sets versus three weak GWAS credible sets (maximum z = 4.32) with no shared variant. In multi-signal regions with weak GWAS evidence, coloc.abf can overstate PP.H4. The retained 15 candidates therefore do not depend on the single-causal-variant assumption for their support: they were selected on the primary coloc.abf analysis and, where testable, survived directional replication in GTEx and FinnGen.</w:t>
+        <w:t>Coloc.susie with SuSiE fine-mapping did not converge under external 1000 Genomes EUR LD for any of the six tested loci spanning different signal architectures (RBM6×T2D, CNNM2×CAD, PLAUR×CAD, CD101×T2D, RIC8A×CAD, LAMC1×CAD). This is a known limitation when summary statistics and reference panels are imperfectly matched. We therefore do not rely on SuSiE posteriors for primary inference and report them only as exploratory sensitivity evidence (Table S2). The one locus that showed multi-signal architecture, LAMC1×CAD (coloc.abf PP.H4 = 0.9139), was independently excluded by the FDR filter (padj ≥ 0.05): fine-mapping revealed eight independent eQTL credible sets versus three weak GWAS credible sets (maximum z = 4.32) with no shared variant. In multi-signal regions with weak GWAS evidence, coloc.abf can overstate PP.H4. The retained 15 candidates therefore do not depend on the single-causal-variant assumption for their support: they were selected on the primary coloc.abf analysis and, where testable, survived directional replication in GTEx and FinnGen.</w:t>
       </w:r>
     </w:p>
     <w:p>
@@ -1746,7 +1746,7 @@
           <w:i w:val="0"/>
           <w:sz w:val="24"/>
         </w:rPr>
-        <w:t>We present a transcriptome-wide cis-MR × coloc atlas for T2D, CAD, and FG that quantifies the operating characteristics of the standard gene-prioritization pipeline. We highlight three results. First, coloc yield calibrates monotonically with MR evidence (0.42% across all QC-passed pairs → 25.6% across the MR p-value funnel). Two independent filtering strategies, per-outcome BH-FDR (12.32%) and LD clumping plus instrumental replication (12.96%), converge on a shared-causal-variant rate of approximately 12–13% among MR-supported pairs. Second, strong colocalization is essentially absent outside the MR-significant set (2/27,123 pairs; one-sided 95% upper bound 0.0232%/pair), providing a decisive negative boundary that constrains false-positive rates for a well-specified coloc prior. Finally, all 106 previously reported strong colocalizations reproduced, and 15 additional candidate effector genes survived directional replication in GTEx and FinnGen, with HEIDI and Steiger support in the known-locus set.</w:t>
+        <w:t>We present a transcriptome-wide cis-MR × coloc atlas for T2D, CAD, and FG that quantifies the operating characteristics of the standard gene-prioritization pipeline. We focus on three findings. First, coloc yield calibrates monotonically with MR evidence (0.42% across all QC-passed pairs → 25.6% across the MR p-value funnel). Two independent filtering strategies, per-outcome BH-FDR (12.32%) and LD clumping plus instrumental replication (12.96%), converge on a shared-causal-variant rate of approximately 12–13% among MR-supported pairs. Second, strong colocalization is essentially absent outside the MR-significant set (2/27,123 pairs; one-sided 95% upper bound 0.0232%/pair), providing a decisive negative boundary that constrains false-positive rates for a well-specified coloc prior. Finally, all 106 previously reported strong colocalizations reproduced, and 15 additional candidate effector genes survived directional replication in GTEx and FinnGen, with HEIDI and Steiger support in the known-locus set.</w:t>
       </w:r>
     </w:p>
     <w:p>

</xml_diff>

<commit_message>
Address reviewer points: define stage-2 grid, weak-instrument bias, FG power, LAMC1 lesson
- 2.2: define the stage-2 grid explicitly (independently constructed earlier cis-MR x
  coloc screen, LD-clumped + instrumentally replicated; 818 evaluable pairs -> 106
  strong = 12.96%; those 106 are the previously reported loci; serves as internal
  positive control benchmarking the FDR-core yield)
- 2.2: report instrument strength accurately as max cis-eQTL Z (=sqrt F); selection
  at p < 5e-6 implies F > 20 for every retained instrument
- 3.1: add weak-instrument statement (all instruments F > 10) and explicit FG
  underpoweredness (n=58,074; 12 MR-sig, 2 strong; no FinnGen analog; replication
  and nomination focus on T2D/CAD)
- Discussion: dedicated LAMC1 paragraph on single-causal-variant assumption
  false-positive hazard (coloc.abf PP.H4 0.91 vs 8 eQTL / 3 GWAS credible sets,
  no shared variant)
- Rebuild AJHG DOCX (1370/1370 runs Times New Roman; abstract 169 words; 0 em-dashes)
</commit_message>
<xml_diff>
--- a/docs/manuscript/AJHG_submission_Qiushuo_Geng_20260816.docx
+++ b/docs/manuscript/AJHG_submission_Qiushuo_Geng_20260816.docx
@@ -928,7 +928,7 @@
           <w:i w:val="0"/>
           <w:sz w:val="24"/>
         </w:rPr>
-        <w:t xml:space="preserve">. We report the maximum eQTL F-statistic among cis variants for each gene–trait pair to assess weak-instrument bias </w:t>
+        <w:t xml:space="preserve">. We report the maximum cis-eQTL Z-statistic among cis variants for each gene–trait pair as a measure of instrument strength (Z = √F) to assess weak-instrument bias </w:t>
       </w:r>
       <w:r>
         <w:rPr>
@@ -966,7 +966,7 @@
           <w:i w:val="0"/>
           <w:sz w:val="24"/>
         </w:rPr>
-        <w:t xml:space="preserve">. F-statistics are reported in the Zenodo atlas and summarized visually in Figure 5C. MR significance was defined as per-outcome Benjamini–Hochberg FDR control at q &lt; 0.05 </w:t>
+        <w:t xml:space="preserve">. Instrument selection at eQTL p &lt; 5e-6 corresponds to an instrument F-statistic above 20 for every retained instrument. Instrument strength is reported in the Zenodo atlas and summarized visually in Figure 5C. MR significance was defined as per-outcome Benjamini–Hochberg FDR control at q &lt; 0.05 </w:t>
       </w:r>
       <w:r>
         <w:rPr>
@@ -985,7 +985,7 @@
           <w:i w:val="0"/>
           <w:sz w:val="24"/>
         </w:rPr>
-        <w:t>, applied within each outcome to the marginal cis-MR p-values (the preregistered multiple-testing control; Section 2.6). A stage-2 grid (the previously reported strong-colocalization set plus LD-clumped re-checked candidates) was analyzed separately with the same instrument pipeline.</w:t>
+        <w:t>, applied within each outcome to the marginal cis-MR p-values (the preregistered multiple-testing control; Section 2.6). A stage-2 grid was analyzed separately with the same instrument pipeline. The grid is an independently constructed cis-MR × coloc screen from our earlier pipeline, built with LD-clumped, instrumentally replicated instruments; among 818 evaluable gene–trait pairs, 106 reached strong colocalization (12.96%; 95% CI 10.83–15.43%). These 106 are the previously reported loci reproduced by the full-scan pipeline (Section 3.4) and serve as an internal positive control that benchmarks the FDR-core yield (Section 3.2; Table 1).</w:t>
       </w:r>
     </w:p>
     <w:p>
@@ -1486,7 +1486,7 @@
           <w:i w:val="0"/>
           <w:sz w:val="24"/>
         </w:rPr>
-        <w:t>After quality control, 31,371 gene–trait pairs remained for analysis (31,373 tested; 2 failed QC). Applying the preregistered per-outcome BH-FDR control at q &lt; 0.05 identified 982 MR-significant pairs (T2D 394; CAD 576; FG 12). Of these, 121 reached strong colocalization (PP.H4 ≥ 0.8): T2D 65, CAD 54, FG 2 (Fig 1). The preregistered FDR-core yield was 12.32% (95% CI 10.41–14.53%). Two additional pairs (AP3S2×T2D, ZNF19×CAD) reached strong colocalization in the MR-null range and none in the MR-negative range (Section 3.3). The 121 MR-significant strong pairs comprised all 106 previously reported loci and 15 additional candidate effector genes.</w:t>
+        <w:t>After quality control, 31,371 gene–trait pairs remained for analysis (31,373 tested; 2 failed QC). Applying the preregistered per-outcome BH-FDR control at q &lt; 0.05 identified 982 MR-significant pairs (T2D 394; CAD 576; FG 12). Of these, 121 reached strong colocalization (PP.H4 ≥ 0.8): T2D 65, CAD 54, FG 2 (Fig 1). The preregistered FDR-core yield was 12.32% (95% CI 10.41–14.53%). All retained cis-eQTL instruments exceeded the conventional weak-instrument threshold (F &gt; 10), mitigating weak-instrument bias (Methods 2.2). The FG scan was the least informative: its GWAS (n = 58,074) is substantially smaller than the T2D (n = 655,666) and CAD (n = 296,525) meta-analyses, so few FG gene–trait pairs survived multiple testing (12 MR-significant, 2 strong colocalizations), and FG has no FinnGen analog for replication; replication and candidate nomination therefore focus on T2D and CAD. Two additional pairs (AP3S2×T2D, ZNF19×CAD) reached strong colocalization in the MR-null range and none in the MR-negative range (Section 3.3). The 121 MR-significant strong pairs comprised all 106 previously reported loci and 15 additional candidate effector genes.</w:t>
       </w:r>
     </w:p>
     <w:p>
@@ -1789,6 +1789,20 @@
           <w:sz w:val="24"/>
         </w:rPr>
         <w:t>Eight additional loci reached strong colocalization at nominal MR significance but not after per-outcome FDR control (Table S3). These include LAMC1×CAD, which reached nominal significance in independent FinnGen data (p = 0.018), and SENP6×CAD and HMGN3×CAD, which showed directionally concordant FinnGen estimates. Their exclusion illustrates the conservative nature of genome-wide FDR control in this setting. The per-outcome FDR threshold (q &lt; 0.05) retains 982 of 4,248 (23%) nominally significant pairs and with it discards some colocalized signals along with most weak MR evidence. Investigators using this atlas for hypothesis generation may wish to inspect the nominal set (n = 4,248) as a broader, lower-confidence tier.</w:t>
+      </w:r>
+    </w:p>
+    <w:p>
+      <w:pPr>
+        <w:spacing w:line="480" w:lineRule="auto" w:after="0"/>
+      </w:pPr>
+      <w:r>
+        <w:rPr>
+          <w:rFonts w:ascii="Times New Roman" w:hAnsi="Times New Roman" w:eastAsia="Times New Roman" w:cs="Times New Roman"/>
+          <w:b w:val="0"/>
+          <w:i w:val="0"/>
+          <w:sz w:val="24"/>
+        </w:rPr>
+        <w:t>LAMC1×CAD illustrates a methodological hazard worth making explicit. Under the single-causal-variant assumption of coloc.abf it returned PP.H4 = 0.91, a superficially strong colocalization; SuSiE fine-mapping instead resolved eight independent eQTL credible sets against three weak GWAS credible sets (maximum z = 4.32) with no shared variant, and the pair was independently excluded by the per-outcome FDR filter (padj ≥ 0.05). In multi-signal regions with weak GWAS evidence, coloc.abf can therefore overstate PP.H4 even when no single causal variant is shared. We treat this case as a cautionary example of why the preregistered FDR control and multi-signal inspection accompany coloc.abf here; the retained 15 candidates do not depend on the single-causal-variant assumption for their support (Section 3.7).</w:t>
       </w:r>
     </w:p>
     <w:p>

</xml_diff>